<commit_message>
docs(proposal): rebuild PDF and DOCX
</commit_message>
<xml_diff>
--- a/docs/proposal/proposal.docx
+++ b/docs/proposal/proposal.docx
@@ -17,7 +17,7 @@
         <w:t xml:space="preserve"> </w:t>
       </w:r>
       <w:r>
-        <w:t xml:space="preserve">Data Visualization</w:t>
+        <w:t xml:space="preserve">IT138IU – Data Science and Data Visualization</w:t>
       </w:r>
       <w:r>
         <w:t xml:space="preserve"> </w:t>
@@ -449,22 +449,20 @@
         <w:t xml:space="preserve"> </w:t>
       </w:r>
       <w:r>
-        <w:t xml:space="preserve">8 countries — Vietnam, Indonesia, Thailand, Malaysia, the Philippines, Cambodia, Laos and Myanmar — and 12 indicators from two Environment themes, all present for all 8 countries, with coverage checked row by row.</w:t>
+        <w:t xml:space="preserve">8 countries (Vietnam, Indonesia, Thailand, Malaysia, the Philippines, Cambodia, Laos and Myanmar) and 12 indicators from two Environment themes, all present for all 8 countries, with coverage checked row by row. Indicator codes are listed in the repository README.</w:t>
       </w:r>
     </w:p>
     <w:tbl>
       <w:tblPr>
         <w:tblStyle w:val="Table"/>
-        <w:tblW w:type="pct" w:w="5000"/>
-        <w:tblLayout w:type="fixed"/>
+        <w:tblW w:type="auto" w:w="0"/>
         <w:tblLook w:firstRow="1" w:lastRow="0" w:firstColumn="0" w:lastColumn="0" w:noHBand="0" w:noVBand="0" w:val="0020"/>
       </w:tblPr>
       <w:tblGrid>
-        <w:gridCol w:w="1584"/>
-        <w:gridCol w:w="1584"/>
-        <w:gridCol w:w="1584"/>
-        <w:gridCol w:w="1584"/>
-        <w:gridCol w:w="1584"/>
+        <w:gridCol w:w="1980"/>
+        <w:gridCol w:w="1980"/>
+        <w:gridCol w:w="1980"/>
+        <w:gridCol w:w="1980"/>
       </w:tblGrid>
       <w:tr>
         <w:trPr>
@@ -499,17 +497,6 @@
               <w:pStyle w:val="Compact"/>
             </w:pPr>
             <w:r>
-              <w:t xml:space="preserve">Code</w:t>
-            </w:r>
-          </w:p>
-        </w:tc>
-        <w:tc>
-          <w:tcPr/>
-          <w:p>
-            <w:pPr>
-              <w:pStyle w:val="Compact"/>
-            </w:pPr>
-            <w:r>
               <w:t xml:space="preserve">Unit</w:t>
             </w:r>
           </w:p>
@@ -556,17 +543,6 @@
               <w:pStyle w:val="Compact"/>
             </w:pPr>
             <w:r>
-              <w:t xml:space="preserve">AG.LND.FRST.ZS</w:t>
-            </w:r>
-          </w:p>
-        </w:tc>
-        <w:tc>
-          <w:tcPr/>
-          <w:p>
-            <w:pPr>
-              <w:pStyle w:val="Compact"/>
-            </w:pPr>
-            <w:r>
               <w:t xml:space="preserve">% of land area</w:t>
             </w:r>
           </w:p>
@@ -613,17 +589,6 @@
               <w:pStyle w:val="Compact"/>
             </w:pPr>
             <w:r>
-              <w:t xml:space="preserve">AG.LND.FRLS.HA</w:t>
-            </w:r>
-          </w:p>
-        </w:tc>
-        <w:tc>
-          <w:tcPr/>
-          <w:p>
-            <w:pPr>
-              <w:pStyle w:val="Compact"/>
-            </w:pPr>
-            <w:r>
               <w:t xml:space="preserve">hectares</w:t>
             </w:r>
           </w:p>
@@ -670,17 +635,6 @@
               <w:pStyle w:val="Compact"/>
             </w:pPr>
             <w:r>
-              <w:t xml:space="preserve">ER.PTD.TOTL.ZS</w:t>
-            </w:r>
-          </w:p>
-        </w:tc>
-        <w:tc>
-          <w:tcPr/>
-          <w:p>
-            <w:pPr>
-              <w:pStyle w:val="Compact"/>
-            </w:pPr>
-            <w:r>
               <w:t xml:space="preserve">% of territory</w:t>
             </w:r>
           </w:p>
@@ -727,17 +681,6 @@
               <w:pStyle w:val="Compact"/>
             </w:pPr>
             <w:r>
-              <w:t xml:space="preserve">NY.ADJ.DRES.GN.ZS</w:t>
-            </w:r>
-          </w:p>
-        </w:tc>
-        <w:tc>
-          <w:tcPr/>
-          <w:p>
-            <w:pPr>
-              <w:pStyle w:val="Compact"/>
-            </w:pPr>
-            <w:r>
               <w:t xml:space="preserve">% of GNI</w:t>
             </w:r>
           </w:p>
@@ -784,17 +727,6 @@
               <w:pStyle w:val="Compact"/>
             </w:pPr>
             <w:r>
-              <w:t xml:space="preserve">NY.ADJ.DFOR.GN.ZS</w:t>
-            </w:r>
-          </w:p>
-        </w:tc>
-        <w:tc>
-          <w:tcPr/>
-          <w:p>
-            <w:pPr>
-              <w:pStyle w:val="Compact"/>
-            </w:pPr>
-            <w:r>
               <w:t xml:space="preserve">% of GNI</w:t>
             </w:r>
           </w:p>
@@ -841,17 +773,6 @@
               <w:pStyle w:val="Compact"/>
             </w:pPr>
             <w:r>
-              <w:t xml:space="preserve">ER.H2O.FWTL.ZS</w:t>
-            </w:r>
-          </w:p>
-        </w:tc>
-        <w:tc>
-          <w:tcPr/>
-          <w:p>
-            <w:pPr>
-              <w:pStyle w:val="Compact"/>
-            </w:pPr>
-            <w:r>
               <w:t xml:space="preserve">% of internal res.</w:t>
             </w:r>
           </w:p>
@@ -898,17 +819,6 @@
               <w:pStyle w:val="Compact"/>
             </w:pPr>
             <w:r>
-              <w:t xml:space="preserve">EG.EGY.PRIM.PP.KD</w:t>
-            </w:r>
-          </w:p>
-        </w:tc>
-        <w:tc>
-          <w:tcPr/>
-          <w:p>
-            <w:pPr>
-              <w:pStyle w:val="Compact"/>
-            </w:pPr>
-            <w:r>
               <w:t xml:space="preserve">MJ/$2017 PPP GDP</w:t>
             </w:r>
           </w:p>
@@ -955,17 +865,6 @@
               <w:pStyle w:val="Compact"/>
             </w:pPr>
             <w:r>
-              <w:t xml:space="preserve">EG.FEC.RNEW.ZS</w:t>
-            </w:r>
-          </w:p>
-        </w:tc>
-        <w:tc>
-          <w:tcPr/>
-          <w:p>
-            <w:pPr>
-              <w:pStyle w:val="Compact"/>
-            </w:pPr>
-            <w:r>
               <w:t xml:space="preserve">% of final energy</w:t>
             </w:r>
           </w:p>
@@ -1012,17 +911,6 @@
               <w:pStyle w:val="Compact"/>
             </w:pPr>
             <w:r>
-              <w:t xml:space="preserve">EG.ELC.RNEW.ZS</w:t>
-            </w:r>
-          </w:p>
-        </w:tc>
-        <w:tc>
-          <w:tcPr/>
-          <w:p>
-            <w:pPr>
-              <w:pStyle w:val="Compact"/>
-            </w:pPr>
-            <w:r>
               <w:t xml:space="preserve">% of electricity</w:t>
             </w:r>
           </w:p>
@@ -1069,17 +957,6 @@
               <w:pStyle w:val="Compact"/>
             </w:pPr>
             <w:r>
-              <w:t xml:space="preserve">EG.USE.PCAP.KG.OE</w:t>
-            </w:r>
-          </w:p>
-        </w:tc>
-        <w:tc>
-          <w:tcPr/>
-          <w:p>
-            <w:pPr>
-              <w:pStyle w:val="Compact"/>
-            </w:pPr>
-            <w:r>
               <w:t xml:space="preserve">kg oil equivalent</w:t>
             </w:r>
           </w:p>
@@ -1126,17 +1003,6 @@
               <w:pStyle w:val="Compact"/>
             </w:pPr>
             <w:r>
-              <w:t xml:space="preserve">EG.USE.COMM.FO.ZS</w:t>
-            </w:r>
-          </w:p>
-        </w:tc>
-        <w:tc>
-          <w:tcPr/>
-          <w:p>
-            <w:pPr>
-              <w:pStyle w:val="Compact"/>
-            </w:pPr>
-            <w:r>
               <w:t xml:space="preserve">% of total energy</w:t>
             </w:r>
           </w:p>
@@ -1173,17 +1039,6 @@
             </w:pPr>
             <w:r>
               <w:t xml:space="preserve">Electricity from coal</w:t>
-            </w:r>
-          </w:p>
-        </w:tc>
-        <w:tc>
-          <w:tcPr/>
-          <w:p>
-            <w:pPr>
-              <w:pStyle w:val="Compact"/>
-            </w:pPr>
-            <w:r>
-              <w:t xml:space="preserve">EG.ELC.COAL.ZS</w:t>
             </w:r>
           </w:p>
         </w:tc>
@@ -1529,7 +1384,7 @@
         <w:pStyle w:val="FirstParagraph"/>
       </w:pPr>
       <w:r>
-        <w:t xml:space="preserve">All three designs answer the same question with the same three levels — region, one country, one indicator over time — and differ in how the reader moves between them. The six sketches are in the appendix.</w:t>
+        <w:t xml:space="preserve">All three designs answer the same question with the same three levels (region, one country, one indicator over time) and differ in how the reader moves between them. The six sketches are in the appendix.</w:t>
       </w:r>
     </w:p>
     <w:bookmarkStart w:id="13" w:name="design-a-story-first-then-explore"/>
@@ -2361,15 +2216,12 @@
     <w:tbl>
       <w:tblPr>
         <w:tblStyle w:val="Table"/>
-        <w:tblW w:type="pct" w:w="5000"/>
-        <w:tblLayout w:type="fixed"/>
+        <w:tblW w:type="auto" w:w="0"/>
         <w:tblLook w:firstRow="1" w:lastRow="0" w:firstColumn="0" w:lastColumn="0" w:noHBand="0" w:noVBand="0" w:val="0020"/>
       </w:tblPr>
       <w:tblGrid>
-        <w:gridCol w:w="1980"/>
-        <w:gridCol w:w="1980"/>
-        <w:gridCol w:w="1980"/>
-        <w:gridCol w:w="1980"/>
+        <w:gridCol w:w="3960"/>
+        <w:gridCol w:w="3960"/>
       </w:tblGrid>
       <w:tr>
         <w:trPr>
@@ -2393,29 +2245,7 @@
               <w:pStyle w:val="Compact"/>
             </w:pPr>
             <w:r>
-              <w:t xml:space="preserve">Dates</w:t>
-            </w:r>
-          </w:p>
-        </w:tc>
-        <w:tc>
-          <w:tcPr/>
-          <w:p>
-            <w:pPr>
-              <w:pStyle w:val="Compact"/>
-            </w:pPr>
-            <w:r>
               <w:t xml:space="preserve">Milestone</w:t>
-            </w:r>
-          </w:p>
-        </w:tc>
-        <w:tc>
-          <w:tcPr/>
-          <w:p>
-            <w:pPr>
-              <w:pStyle w:val="Compact"/>
-            </w:pPr>
-            <w:r>
-              <w:t xml:space="preserve">Lead</w:t>
             </w:r>
           </w:p>
         </w:tc>
@@ -2439,29 +2269,7 @@
               <w:pStyle w:val="Compact"/>
             </w:pPr>
             <w:r>
-              <w:t xml:space="preserve">Oct 5–11</w:t>
-            </w:r>
-          </w:p>
-        </w:tc>
-        <w:tc>
-          <w:tcPr/>
-          <w:p>
-            <w:pPr>
-              <w:pStyle w:val="Compact"/>
-            </w:pPr>
-            <w:r>
               <w:t xml:space="preserve">Kickoff: repo, proposal, sketches</w:t>
-            </w:r>
-          </w:p>
-        </w:tc>
-        <w:tc>
-          <w:tcPr/>
-          <w:p>
-            <w:pPr>
-              <w:pStyle w:val="Compact"/>
-            </w:pPr>
-            <w:r>
-              <w:t xml:space="preserve">All</w:t>
             </w:r>
           </w:p>
         </w:tc>
@@ -2485,29 +2293,7 @@
               <w:pStyle w:val="Compact"/>
             </w:pPr>
             <w:r>
-              <w:t xml:space="preserve">Oct 12–18</w:t>
-            </w:r>
-          </w:p>
-        </w:tc>
-        <w:tc>
-          <w:tcPr/>
-          <w:p>
-            <w:pPr>
-              <w:pStyle w:val="Compact"/>
-            </w:pPr>
-            <w:r>
               <w:t xml:space="preserve">Design chosen; JSON schema; skeleton</w:t>
-            </w:r>
-          </w:p>
-        </w:tc>
-        <w:tc>
-          <w:tcPr/>
-          <w:p>
-            <w:pPr>
-              <w:pStyle w:val="Compact"/>
-            </w:pPr>
-            <w:r>
-              <w:t xml:space="preserve">All</w:t>
             </w:r>
           </w:p>
         </w:tc>
@@ -2531,29 +2317,7 @@
               <w:pStyle w:val="Compact"/>
             </w:pPr>
             <w:r>
-              <w:t xml:space="preserve">Oct 19–25</w:t>
-            </w:r>
-          </w:p>
-        </w:tc>
-        <w:tc>
-          <w:tcPr/>
-          <w:p>
-            <w:pPr>
-              <w:pStyle w:val="Compact"/>
-            </w:pPr>
-            <w:r>
               <w:t xml:space="preserve">JSON v1; region chart; controls</w:t>
-            </w:r>
-          </w:p>
-        </w:tc>
-        <w:tc>
-          <w:tcPr/>
-          <w:p>
-            <w:pPr>
-              <w:pStyle w:val="Compact"/>
-            </w:pPr>
-            <w:r>
-              <w:t xml:space="preserve">Lê Quân, Quế, Hoàng Quân</w:t>
             </w:r>
           </w:p>
         </w:tc>
@@ -2577,29 +2341,7 @@
               <w:pStyle w:val="Compact"/>
             </w:pPr>
             <w:r>
-              <w:t xml:space="preserve">Oct 26–Nov 1</w:t>
-            </w:r>
-          </w:p>
-        </w:tc>
-        <w:tc>
-          <w:tcPr/>
-          <w:p>
-            <w:pPr>
-              <w:pStyle w:val="Compact"/>
-            </w:pPr>
-            <w:r>
               <w:t xml:space="preserve">Country and indicator levels; drill-down</w:t>
-            </w:r>
-          </w:p>
-        </w:tc>
-        <w:tc>
-          <w:tcPr/>
-          <w:p>
-            <w:pPr>
-              <w:pStyle w:val="Compact"/>
-            </w:pPr>
-            <w:r>
-              <w:t xml:space="preserve">Quế, Hoàng Quân</w:t>
             </w:r>
           </w:p>
         </w:tc>
@@ -2623,29 +2365,7 @@
               <w:pStyle w:val="Compact"/>
             </w:pPr>
             <w:r>
-              <w:t xml:space="preserve">Nov 2–8</w:t>
-            </w:r>
-          </w:p>
-        </w:tc>
-        <w:tc>
-          <w:tcPr/>
-          <w:p>
-            <w:pPr>
-              <w:pStyle w:val="Compact"/>
-            </w:pPr>
-            <w:r>
               <w:t xml:space="preserve">Midterm: integration and bug fixes</w:t>
-            </w:r>
-          </w:p>
-        </w:tc>
-        <w:tc>
-          <w:tcPr/>
-          <w:p>
-            <w:pPr>
-              <w:pStyle w:val="Compact"/>
-            </w:pPr>
-            <w:r>
-              <w:t xml:space="preserve">All</w:t>
             </w:r>
           </w:p>
         </w:tc>
@@ -2659,17 +2379,6 @@
             </w:pPr>
             <w:r>
               <w:t xml:space="preserve">6</w:t>
-            </w:r>
-          </w:p>
-        </w:tc>
-        <w:tc>
-          <w:tcPr/>
-          <w:p>
-            <w:pPr>
-              <w:pStyle w:val="Compact"/>
-            </w:pPr>
-            <w:r>
-              <w:t xml:space="preserve">Nov 9–15</w:t>
             </w:r>
           </w:p>
         </w:tc>
@@ -2691,17 +2400,6 @@
             </w:r>
           </w:p>
         </w:tc>
-        <w:tc>
-          <w:tcPr/>
-          <w:p>
-            <w:pPr>
-              <w:pStyle w:val="Compact"/>
-            </w:pPr>
-            <w:r>
-              <w:t xml:space="preserve">All</w:t>
-            </w:r>
-          </w:p>
-        </w:tc>
       </w:tr>
       <w:tr>
         <w:tc>
@@ -2722,29 +2420,7 @@
               <w:pStyle w:val="Compact"/>
             </w:pPr>
             <w:r>
-              <w:t xml:space="preserve">Nov 16–22</w:t>
-            </w:r>
-          </w:p>
-        </w:tc>
-        <w:tc>
-          <w:tcPr/>
-          <w:p>
-            <w:pPr>
-              <w:pStyle w:val="Compact"/>
-            </w:pPr>
-            <w:r>
               <w:t xml:space="preserve">Feedback and improvements</w:t>
-            </w:r>
-          </w:p>
-        </w:tc>
-        <w:tc>
-          <w:tcPr/>
-          <w:p>
-            <w:pPr>
-              <w:pStyle w:val="Compact"/>
-            </w:pPr>
-            <w:r>
-              <w:t xml:space="preserve">All</w:t>
             </w:r>
           </w:p>
         </w:tc>
@@ -2768,29 +2444,7 @@
               <w:pStyle w:val="Compact"/>
             </w:pPr>
             <w:r>
-              <w:t xml:space="preserve">Nov 23–29</w:t>
-            </w:r>
-          </w:p>
-        </w:tc>
-        <w:tc>
-          <w:tcPr/>
-          <w:p>
-            <w:pPr>
-              <w:pStyle w:val="Compact"/>
-            </w:pPr>
-            <w:r>
               <w:t xml:space="preserve">Optional features; report sections</w:t>
-            </w:r>
-          </w:p>
-        </w:tc>
-        <w:tc>
-          <w:tcPr/>
-          <w:p>
-            <w:pPr>
-              <w:pStyle w:val="Compact"/>
-            </w:pPr>
-            <w:r>
-              <w:t xml:space="preserve">All</w:t>
             </w:r>
           </w:p>
         </w:tc>
@@ -2814,29 +2468,7 @@
               <w:pStyle w:val="Compact"/>
             </w:pPr>
             <w:r>
-              <w:t xml:space="preserve">Nov 30–Dec 6</w:t>
-            </w:r>
-          </w:p>
-        </w:tc>
-        <w:tc>
-          <w:tcPr/>
-          <w:p>
-            <w:pPr>
-              <w:pStyle w:val="Compact"/>
-            </w:pPr>
-            <w:r>
               <w:t xml:space="preserve">Feature freeze, testing, report</w:t>
-            </w:r>
-          </w:p>
-        </w:tc>
-        <w:tc>
-          <w:tcPr/>
-          <w:p>
-            <w:pPr>
-              <w:pStyle w:val="Compact"/>
-            </w:pPr>
-            <w:r>
-              <w:t xml:space="preserve">All</w:t>
             </w:r>
           </w:p>
         </w:tc>
@@ -2850,17 +2482,6 @@
             </w:pPr>
             <w:r>
               <w:t xml:space="preserve">10</w:t>
-            </w:r>
-          </w:p>
-        </w:tc>
-        <w:tc>
-          <w:tcPr/>
-          <w:p>
-            <w:pPr>
-              <w:pStyle w:val="Compact"/>
-            </w:pPr>
-            <w:r>
-              <w:t xml:space="preserve">Dec 7–13</w:t>
             </w:r>
           </w:p>
         </w:tc>
@@ -2879,17 +2500,6 @@
             </w:r>
           </w:p>
         </w:tc>
-        <w:tc>
-          <w:tcPr/>
-          <w:p>
-            <w:pPr>
-              <w:pStyle w:val="Compact"/>
-            </w:pPr>
-            <w:r>
-              <w:t xml:space="preserve">All</w:t>
-            </w:r>
-          </w:p>
-        </w:tc>
       </w:tr>
     </w:tbl>
     <w:p>
@@ -2897,7 +2507,7 @@
         <w:pStyle w:val="BodyText"/>
       </w:pPr>
       <w:r>
-        <w:t xml:space="preserve">Weeks 1–2 include time to learn D3.js, as no member has built a frontend before.</w:t>
+        <w:t xml:space="preserve">Weeks 3–4 are led by Trần Nguyễn Lê Quân (data), Lê Xuân Quế and Đặng Hoàng Quân (frontend); all other weeks are shared. Weeks 1–2 include time to learn D3.js, as no member has built a frontend before.</w:t>
       </w:r>
     </w:p>
     <w:bookmarkEnd w:id="20"/>

</xml_diff>

<commit_message>
docs(proposal): condense schedule and references to fit 4 pages
</commit_message>
<xml_diff>
--- a/docs/proposal/proposal.docx
+++ b/docs/proposal/proposal.docx
@@ -294,7 +294,7 @@
         <w:pStyle w:val="FirstParagraph"/>
       </w:pPr>
       <w:r>
-        <w:t xml:space="preserve">The World Bank’s Sovereign ESG framework evaluates the environmental dimension of economic performance through natural-resource endowment and management alongside sustainable energy use [1], which makes forest resources, resource depletion, freshwater use, energy intensity, renewable energy and fossil-fuel dependence relevant dimensions of environmental sustainability. For Viet Nam this is also national policy: the National Climate Change Strategy targets net-zero greenhouse-gas emissions by 2050 and a 2050 forest cover target of 43% [3]. The World Bank records Viet Nam’s forest area at 47.2% of land area in 2022 [1]; the two figures use different forest definitions and are not directly comparable.</w:t>
+        <w:t xml:space="preserve">The World Bank’s Sovereign ESG framework evaluates the environmental dimension of economic performance through natural-resource endowment and management alongside sustainable energy use [1], which makes forest resources, resource depletion, freshwater use, energy intensity, renewable energy and fossil-fuel dependence relevant dimensions of environmental sustainability. For Viet Nam this is also national policy: the National Climate Change Strategy targets net-zero greenhouse-gas emissions by 2050 and a 2050 forest cover target of 43% [2]. The World Bank records Viet Nam’s forest area at 47.2% of land area in 2022 [1]; the two figures use different forest definitions and are not directly comparable.</w:t>
       </w:r>
     </w:p>
     <w:p>
@@ -302,7 +302,7 @@
         <w:pStyle w:val="BodyText"/>
       </w:pPr>
       <w:r>
-        <w:t xml:space="preserve">According to Ember, Viet Nam’s electricity demand grew by an average of 8.2% per year between 2013 and 2024, and coal-based generation expanded over the same period to meet it, while wind and solar also grew substantially [5]; across the region, coal supplied 45% of ASEAN electricity generation in 2024 [4]. Viet Nam alone therefore cannot show its position, whereas comparing it with Indonesia, Thailand, Malaysia, the Philippines, Cambodia, Laos and Myanmar reveals differences in resource conditions, resource pressure and energy transition without assuming one indicator represents sustainability as a whole.</w:t>
+        <w:t xml:space="preserve">According to Ember, Viet Nam’s electricity demand grew by an average of 8.2% per year between 2013 and 2024, and coal-based generation expanded over the same period to meet it, while wind and solar also grew substantially [3]; across the region, coal supplied 45% of ASEAN electricity generation in 2024 [3]. Viet Nam alone therefore cannot show its position, whereas comparing it with Indonesia, Thailand, Malaysia, the Philippines, Cambodia, Laos and Myanmar reveals differences in resource conditions, resource pressure and energy transition without assuming one indicator represents sustainability as a whole.</w:t>
       </w:r>
     </w:p>
     <w:p>
@@ -422,7 +422,7 @@
         <w:t xml:space="preserve"> </w:t>
       </w:r>
       <w:r>
-        <w:t xml:space="preserve">One public source, the World Bank Sovereign ESG dataset [1], [2], downloaded once as a CSV (</w:t>
+        <w:t xml:space="preserve">One public source, the World Bank Sovereign ESG dataset [1], downloaded once as a CSV (</w:t>
       </w:r>
       <w:r>
         <w:rPr>
@@ -1413,7 +1413,7 @@
         <w:t xml:space="preserve"> </w:t>
       </w:r>
       <w:r>
-        <w:t xml:space="preserve">structure of narrative visualization [6] (Figure 1). A hero states the question, a one-sentence answer and three headline numbers with a better or worse tag: forest area +18.4 points since 1990, renewable energy share −51.7 points since 1990, and 2.9% of territory protected. Three story blocks follow, each with a conclusion as its title, one chart and two sentences. An explore section then gives shared indicator, country and year controls driving a ranked bar list with an orientation map, a dot plot of all 12 indicators for the selected country, and a trend line against the regional median; clicking a country drills down and a back control returns (Figure 2). Only Vietnam is coloured, and better and worse carry symbol, word and colour together.</w:t>
+        <w:t xml:space="preserve">structure of narrative visualization [4] (Figure 1). A hero states the question, a one-sentence answer and three headline numbers with a better or worse tag: forest area +18.4 points since 1990, renewable energy share −51.7 points since 1990, and 2.9% of territory protected. Three story blocks follow, each with a conclusion as its title, one chart and two sentences. An explore section then gives shared indicator, country and year controls driving a ranked bar list with an orientation map, a dot plot of all 12 indicators for the selected country, and a trend line against the regional median; clicking a country drills down and a back control returns (Figure 2). Only Vietnam is coloured, and better and worse carry symbol, word and colour together.</w:t>
       </w:r>
     </w:p>
     <w:p>
@@ -2198,7 +2198,7 @@
         <w:pStyle w:val="FirstParagraph"/>
       </w:pPr>
       <w:r>
-        <w:t xml:space="preserve">Ten weeks from Monday 5 October 2026; the full per-member plan is in the repository at</w:t>
+        <w:t xml:space="preserve">Ten weeks from Monday 5 October 2026; the week-by-week plan is in the repository at</w:t>
       </w:r>
       <w:r>
         <w:t xml:space="preserve"> </w:t>
@@ -2216,7 +2216,8 @@
     <w:tbl>
       <w:tblPr>
         <w:tblStyle w:val="Table"/>
-        <w:tblW w:type="auto" w:w="0"/>
+        <w:tblW w:type="pct" w:w="5000"/>
+        <w:tblLayout w:type="fixed"/>
         <w:tblLook w:firstRow="1" w:lastRow="0" w:firstColumn="0" w:lastColumn="0" w:noHBand="0" w:noVBand="0" w:val="0020"/>
       </w:tblPr>
       <w:tblGrid>
@@ -2258,18 +2259,18 @@
               <w:pStyle w:val="Compact"/>
             </w:pPr>
             <w:r>
-              <w:t xml:space="preserve">1</w:t>
-            </w:r>
-          </w:p>
-        </w:tc>
-        <w:tc>
-          <w:tcPr/>
-          <w:p>
-            <w:pPr>
-              <w:pStyle w:val="Compact"/>
-            </w:pPr>
-            <w:r>
-              <w:t xml:space="preserve">Kickoff: repo, proposal, sketches</w:t>
+              <w:t xml:space="preserve">1–2</w:t>
+            </w:r>
+          </w:p>
+        </w:tc>
+        <w:tc>
+          <w:tcPr/>
+          <w:p>
+            <w:pPr>
+              <w:pStyle w:val="Compact"/>
+            </w:pPr>
+            <w:r>
+              <w:t xml:space="preserve">Kickoff, proposal, design choice, JSON schema, page skeleton</w:t>
             </w:r>
           </w:p>
         </w:tc>
@@ -2282,18 +2283,18 @@
               <w:pStyle w:val="Compact"/>
             </w:pPr>
             <w:r>
-              <w:t xml:space="preserve">2</w:t>
-            </w:r>
-          </w:p>
-        </w:tc>
-        <w:tc>
-          <w:tcPr/>
-          <w:p>
-            <w:pPr>
-              <w:pStyle w:val="Compact"/>
-            </w:pPr>
-            <w:r>
-              <w:t xml:space="preserve">Design chosen; JSON schema; skeleton</w:t>
+              <w:t xml:space="preserve">3–4</w:t>
+            </w:r>
+          </w:p>
+        </w:tc>
+        <w:tc>
+          <w:tcPr/>
+          <w:p>
+            <w:pPr>
+              <w:pStyle w:val="Compact"/>
+            </w:pPr>
+            <w:r>
+              <w:t xml:space="preserve">JSON v1; region, country and indicator levels; shared controls; drill-down</w:t>
             </w:r>
           </w:p>
         </w:tc>
@@ -2306,97 +2307,34 @@
               <w:pStyle w:val="Compact"/>
             </w:pPr>
             <w:r>
-              <w:t xml:space="preserve">3</w:t>
-            </w:r>
-          </w:p>
-        </w:tc>
-        <w:tc>
-          <w:tcPr/>
-          <w:p>
-            <w:pPr>
-              <w:pStyle w:val="Compact"/>
-            </w:pPr>
-            <w:r>
-              <w:t xml:space="preserve">JSON v1; region chart; controls</w:t>
-            </w:r>
-          </w:p>
-        </w:tc>
-      </w:tr>
-      <w:tr>
-        <w:tc>
-          <w:tcPr/>
-          <w:p>
-            <w:pPr>
-              <w:pStyle w:val="Compact"/>
-            </w:pPr>
-            <w:r>
-              <w:t xml:space="preserve">4</w:t>
-            </w:r>
-          </w:p>
-        </w:tc>
-        <w:tc>
-          <w:tcPr/>
-          <w:p>
-            <w:pPr>
-              <w:pStyle w:val="Compact"/>
-            </w:pPr>
-            <w:r>
-              <w:t xml:space="preserve">Country and indicator levels; drill-down</w:t>
-            </w:r>
-          </w:p>
-        </w:tc>
-      </w:tr>
-      <w:tr>
-        <w:tc>
-          <w:tcPr/>
-          <w:p>
-            <w:pPr>
-              <w:pStyle w:val="Compact"/>
-            </w:pPr>
-            <w:r>
-              <w:t xml:space="preserve">5</w:t>
-            </w:r>
-          </w:p>
-        </w:tc>
-        <w:tc>
-          <w:tcPr/>
-          <w:p>
-            <w:pPr>
-              <w:pStyle w:val="Compact"/>
-            </w:pPr>
-            <w:r>
-              <w:t xml:space="preserve">Midterm: integration and bug fixes</w:t>
-            </w:r>
-          </w:p>
-        </w:tc>
-      </w:tr>
-      <w:tr>
-        <w:tc>
-          <w:tcPr/>
-          <w:p>
-            <w:pPr>
-              <w:pStyle w:val="Compact"/>
-            </w:pPr>
-            <w:r>
-              <w:t xml:space="preserve">6</w:t>
-            </w:r>
-          </w:p>
-        </w:tc>
-        <w:tc>
-          <w:tcPr/>
-          <w:p>
-            <w:pPr>
-              <w:pStyle w:val="Compact"/>
-            </w:pPr>
+              <w:t xml:space="preserve">5–6</w:t>
+            </w:r>
+          </w:p>
+        </w:tc>
+        <w:tc>
+          <w:tcPr/>
+          <w:p>
+            <w:pPr>
+              <w:pStyle w:val="Compact"/>
+            </w:pPr>
+            <w:r>
+              <w:t xml:space="preserve">Midterm integration and bug fixes;</w:t>
+            </w:r>
+            <w:r>
+              <w:t xml:space="preserve"> </w:t>
+            </w:r>
             <w:r>
               <w:rPr>
                 <w:b/>
                 <w:bCs/>
               </w:rPr>
-              <w:t xml:space="preserve">Working prototype due</w:t>
-            </w:r>
-            <w:r>
-              <w:t xml:space="preserve">, on GitHub Pages</w:t>
+              <w:t xml:space="preserve">working prototype due</w:t>
+            </w:r>
+            <w:r>
+              <w:t xml:space="preserve"> </w:t>
+            </w:r>
+            <w:r>
+              <w:t xml:space="preserve">(week 6)</w:t>
             </w:r>
           </w:p>
         </w:tc>
@@ -2409,18 +2347,18 @@
               <w:pStyle w:val="Compact"/>
             </w:pPr>
             <w:r>
-              <w:t xml:space="preserve">7</w:t>
-            </w:r>
-          </w:p>
-        </w:tc>
-        <w:tc>
-          <w:tcPr/>
-          <w:p>
-            <w:pPr>
-              <w:pStyle w:val="Compact"/>
-            </w:pPr>
-            <w:r>
-              <w:t xml:space="preserve">Feedback and improvements</w:t>
+              <w:t xml:space="preserve">7–8</w:t>
+            </w:r>
+          </w:p>
+        </w:tc>
+        <w:tc>
+          <w:tcPr/>
+          <w:p>
+            <w:pPr>
+              <w:pStyle w:val="Compact"/>
+            </w:pPr>
+            <w:r>
+              <w:t xml:space="preserve">Feedback, improvements, optional features, report sections</w:t>
             </w:r>
           </w:p>
         </w:tc>
@@ -2433,70 +2371,34 @@
               <w:pStyle w:val="Compact"/>
             </w:pPr>
             <w:r>
-              <w:t xml:space="preserve">8</w:t>
-            </w:r>
-          </w:p>
-        </w:tc>
-        <w:tc>
-          <w:tcPr/>
-          <w:p>
-            <w:pPr>
-              <w:pStyle w:val="Compact"/>
-            </w:pPr>
-            <w:r>
-              <w:t xml:space="preserve">Optional features; report sections</w:t>
-            </w:r>
-          </w:p>
-        </w:tc>
-      </w:tr>
-      <w:tr>
-        <w:tc>
-          <w:tcPr/>
-          <w:p>
-            <w:pPr>
-              <w:pStyle w:val="Compact"/>
-            </w:pPr>
-            <w:r>
-              <w:t xml:space="preserve">9</w:t>
-            </w:r>
-          </w:p>
-        </w:tc>
-        <w:tc>
-          <w:tcPr/>
-          <w:p>
-            <w:pPr>
-              <w:pStyle w:val="Compact"/>
-            </w:pPr>
-            <w:r>
-              <w:t xml:space="preserve">Feature freeze, testing, report</w:t>
-            </w:r>
-          </w:p>
-        </w:tc>
-      </w:tr>
-      <w:tr>
-        <w:tc>
-          <w:tcPr/>
-          <w:p>
-            <w:pPr>
-              <w:pStyle w:val="Compact"/>
-            </w:pPr>
-            <w:r>
-              <w:t xml:space="preserve">10</w:t>
-            </w:r>
-          </w:p>
-        </w:tc>
-        <w:tc>
-          <w:tcPr/>
-          <w:p>
-            <w:pPr>
-              <w:pStyle w:val="Compact"/>
-            </w:pPr>
+              <w:t xml:space="preserve">9–10</w:t>
+            </w:r>
+          </w:p>
+        </w:tc>
+        <w:tc>
+          <w:tcPr/>
+          <w:p>
+            <w:pPr>
+              <w:pStyle w:val="Compact"/>
+            </w:pPr>
+            <w:r>
+              <w:t xml:space="preserve">Feature freeze, testing, report;</w:t>
+            </w:r>
+            <w:r>
+              <w:t xml:space="preserve"> </w:t>
+            </w:r>
             <w:r>
               <w:rPr>
                 <w:b/>
                 <w:bCs/>
               </w:rPr>
-              <w:t xml:space="preserve">Final submission</w:t>
+              <w:t xml:space="preserve">final submission</w:t>
+            </w:r>
+            <w:r>
+              <w:t xml:space="preserve"> </w:t>
+            </w:r>
+            <w:r>
+              <w:t xml:space="preserve">(week 10)</w:t>
             </w:r>
           </w:p>
         </w:tc>
@@ -2533,7 +2435,7 @@
         <w:pStyle w:val="BodyText"/>
       </w:pPr>
       <w:r>
-        <w:t xml:space="preserve">[2] World Bank. About the Sovereign ESG Data Portal. https://esgdata.worldbank.org/about/aboutus?lang=en, accessed 2 October 2026.</w:t>
+        <w:t xml:space="preserve">[2] Chính phủ Việt Nam. 2022. Chiến lược quốc gia về biến đổi khí hậu đến năm 2050 (National Climate Change Strategy to 2050). https://xaydungchinhsach.chinhphu.vn/phe-duyet-chien-luoc-quoc-gia-ve-bien-doi-khi-hau-den-nam-2050-119220727070101019.htm, accessed 2 October 2026.</w:t>
       </w:r>
     </w:p>
     <w:p>
@@ -2541,7 +2443,7 @@
         <w:pStyle w:val="BodyText"/>
       </w:pPr>
       <w:r>
-        <w:t xml:space="preserve">[3] Chính phủ Việt Nam. 2022. Chiến lược quốc gia về biến đổi khí hậu đến năm 2050 (National Climate Change Strategy to 2050). https://xaydungchinhsach.chinhphu.vn/phe-duyet-chien-luoc-quoc-gia-ve-bien-doi-khi-hau-den-nam-2050-119220727070101019.htm, accessed 2 October 2026.</w:t>
+        <w:t xml:space="preserve">[3] Ember. From emission-intensive to investment hotspots: championing renewables in 3 ASEAN economies. https://ember-energy.org/latest-insights/from-emission-intensive-to-investment-hotspots-championing-renewables-in-3-asean-economies/country-snapshots-and-opportunities/, accessed 2 October 2026.</w:t>
       </w:r>
     </w:p>
     <w:p>
@@ -2549,23 +2451,7 @@
         <w:pStyle w:val="BodyText"/>
       </w:pPr>
       <w:r>
-        <w:t xml:space="preserve">[4] Ember. Electricity Data Explorer. https://ember-energy.org/data/electricity-data-explorer/, accessed 2 October 2026.</w:t>
-      </w:r>
-    </w:p>
-    <w:p>
-      <w:pPr>
-        <w:pStyle w:val="BodyText"/>
-      </w:pPr>
-      <w:r>
-        <w:t xml:space="preserve">[5] Ember. From emission-intensive to investment hotspots: championing renewables in 3 ASEAN economies. https://ember-energy.org/latest-insights/from-emission-intensive-to-investment-hotspots-championing-renewables-in-3-asean-economies/country-snapshots-and-opportunities/, accessed 2 October 2026.</w:t>
-      </w:r>
-    </w:p>
-    <w:p>
-      <w:pPr>
-        <w:pStyle w:val="BodyText"/>
-      </w:pPr>
-      <w:r>
-        <w:t xml:space="preserve">[6] Segel, E. and Heer, J. 2010. Narrative Visualization: Telling Stories with Data. IEEE Transactions on Visualization and Computer Graphics 16(6).</w:t>
+        <w:t xml:space="preserve">[4] Segel, E. and Heer, J. 2010. Narrative Visualization: Telling Stories with Data. IEEE Transactions on Visualization and Computer Graphics 16(6).</w:t>
       </w:r>
     </w:p>
     <w:bookmarkEnd w:id="21"/>

</xml_diff>